<commit_message>
Otrosi 9844: forma de pago detallada (pagos a terceros por instruccion de la vendedora), reconocimiento de pago, poder irrevocable y clausula penal; predial VIP por certificacion de exencion
Co-Authored-By: Claude Opus 4.8 <noreply@anthropic.com>
Claude-Session: https://claude.ai/code/session_01V3nTS2cxs4zGL1pJrFeNth
</commit_message>
<xml_diff>
--- a/flipping-01-el-tirol-3-apto-9844/Otrosi-Promesa-DEFINITIVO.docx
+++ b/flipping-01-el-tirol-3-apto-9844/Otrosi-Promesa-DEFINITIVO.docx
@@ -6,7 +6,6 @@
       <w:pPr>
         <w:pStyle w:val="Heading1"/>
       </w:pPr>
-      <w:r/>
       <w:r>
         <w:t>OTROSÍ A CONTRATO DE PROMESA DE COMPRAVENTA</w:t>
       </w:r>
@@ -19,27 +18,72 @@
         <w:rPr>
           <w:b/>
           <w:i/>
+          <w:color w:val="555555"/>
         </w:rPr>
         <w:t>BORRADOR PARA REVISIÓN CON ABOGADO.</w:t>
       </w:r>
       <w:r>
         <w:rPr>
           <w:i/>
+          <w:color w:val="555555"/>
         </w:rPr>
-        <w:t xml:space="preserve"> Versión consolidada que incorpora la entrega, la facultad de designar tercero y las cláusulas de protección (saneamiento, paz y salvos, poder y gastos). Campos entre </w:t>
+        <w:t xml:space="preserve"> Versión consolidada que incorpora la</w:t>
       </w:r>
+    </w:p>
+    <w:p>
+      <w:pPr>
+        <w:ind w:left="360"/>
+      </w:pPr>
       <w:r>
         <w:rPr>
-          <w:rFonts w:ascii="Consolas" w:hAnsi="Consolas"/>
+          <w:b/>
           <w:i/>
+          <w:color w:val="555555"/>
         </w:rPr>
-        <w:t>[ ]</w:t>
+        <w:t>forma de pago y el reconocimiento de pagos</w:t>
       </w:r>
       <w:r>
         <w:rPr>
           <w:i/>
+          <w:color w:val="555555"/>
         </w:rPr>
-        <w:t xml:space="preserve"> por completar.</w:t>
+        <w:t xml:space="preserve"> (incluidos los hechos a terceros</w:t>
+      </w:r>
+    </w:p>
+    <w:p>
+      <w:pPr>
+        <w:ind w:left="360"/>
+      </w:pPr>
+      <w:r>
+        <w:rPr>
+          <w:i/>
+          <w:color w:val="555555"/>
+        </w:rPr>
+        <w:t>por instrucción de la vendedora), la entrega, la facultad de designar tercero y</w:t>
+      </w:r>
+    </w:p>
+    <w:p>
+      <w:pPr>
+        <w:ind w:left="360"/>
+      </w:pPr>
+      <w:r>
+        <w:rPr>
+          <w:i/>
+          <w:color w:val="555555"/>
+        </w:rPr>
+        <w:t>las cláusulas de protección (saneamiento, paz y salvos, poder irrevocable,</w:t>
+      </w:r>
+    </w:p>
+    <w:p>
+      <w:pPr>
+        <w:ind w:left="360"/>
+      </w:pPr>
+      <w:r>
+        <w:rPr>
+          <w:i/>
+          <w:color w:val="555555"/>
+        </w:rPr>
+        <w:t>cláusula penal y gastos). Campos entre `[ ]` por completar.</w:t>
       </w:r>
     </w:p>
     <w:p>
@@ -176,15 +220,18 @@
     </w:p>
     <w:p>
       <w:r>
-        <w:t>estableciendo que la entrega real y material del inmueble se realizará el día</w:t>
+        <w:t>dejando constancia de que la entrega real y material del inmueble al PROMITENTE</w:t>
       </w:r>
     </w:p>
     <w:p>
       <w:r>
+        <w:t xml:space="preserve">COMPRADOR se realizó el día </w:t>
+      </w:r>
+      <w:r>
         <w:rPr>
           <w:b/>
         </w:rPr>
-        <w:t>30 de junio de 2026</w:t>
+        <w:t>26 de junio de 2026</w:t>
       </w:r>
       <w:r>
         <w:t>.</w:t>
@@ -195,74 +242,333 @@
         <w:rPr>
           <w:b/>
         </w:rPr>
-        <w:t>SEGUNDA. FACULTAD DE DESIGNAR TERCERO ADQUIRENTE (CESIÓN).</w:t>
+        <w:t>SEGUNDA. PRECIO, FORMA DE PAGO Y RECONOCIMIENTO DE PAGOS.</w:t>
       </w:r>
       <w:r>
-        <w:t xml:space="preserve"> Las partes</w:t>
+        <w:t xml:space="preserve"> El precio total de la</w:t>
       </w:r>
     </w:p>
     <w:p>
       <w:r>
-        <w:t>adicionan la promesa en el sentido de facultar al PROMITENTE COMPRADOR para que,</w:t>
-      </w:r>
-    </w:p>
-    <w:p>
-      <w:r>
-        <w:t>al momento de la suscripción de la escritura pública de compraventa, pueda</w:t>
-      </w:r>
-    </w:p>
-    <w:p>
-      <w:r>
-        <w:t>**designar como adquirente del inmueble a una persona natural o jurídica distinta</w:t>
-      </w:r>
-    </w:p>
-    <w:p>
-      <w:r>
-        <w:t>de él</w:t>
+        <w:t xml:space="preserve">compraventa es la suma de </w:t>
       </w:r>
       <w:r>
         <w:rPr>
           <w:b/>
         </w:rPr>
-        <w:t xml:space="preserve">, o </w:t>
+        <w:t>$121.000.000</w:t>
       </w:r>
       <w:r>
-        <w:t>ceder su posición contractual** en la presente promesa. Para tal</w:t>
+        <w:t xml:space="preserve"> M/CTE. LA PROMITENTE VENDEDORA **declara</w:t>
       </w:r>
     </w:p>
     <w:p>
       <w:r>
-        <w:t>efecto, el PROMITENTE COMPRADOR deberá informar por escrito a LA PROMITENTE</w:t>
+        <w:t>y reconoce** haber recibido a satisfacción, imputables al precio, los siguientes</w:t>
       </w:r>
     </w:p>
     <w:p>
       <w:r>
-        <w:t>VENDEDORA la identidad del tercero designado con anterioridad al otorgamiento de</w:t>
+        <w:t>pagos, y acepta expresamente que los realizados a terceros se efectuaron **por</w:t>
       </w:r>
     </w:p>
     <w:p>
       <w:r>
-        <w:t>la escritura. La comparecencia de dicho tercero como comprador no alterará el</w:t>
+        <w:t>instrucción suya** y constituyen pago válido del precio a su favor:</w:t>
+      </w:r>
+    </w:p>
+    <w:p>
+      <w:pPr>
+        <w:pStyle w:val="ListNumber"/>
+      </w:pPr>
+      <w:r>
+        <w:rPr>
+          <w:b/>
+        </w:rPr>
+        <w:t>$10.000.000</w:t>
+      </w:r>
+      <w:r>
+        <w:t xml:space="preserve"> M/CTE, pagados </w:t>
+      </w:r>
+      <w:r>
+        <w:rPr>
+          <w:b/>
+        </w:rPr>
+        <w:t>a la suscripción de la promesa de compraventa</w:t>
       </w:r>
     </w:p>
     <w:p>
       <w:r>
-        <w:t>precio, plazos, obligaciones ni demás estipulaciones pactadas. Esta autorización</w:t>
+        <w:t xml:space="preserve">   (13 de mayo de 2026).</w:t>
+      </w:r>
+    </w:p>
+    <w:p>
+      <w:pPr>
+        <w:pStyle w:val="ListNumber"/>
+      </w:pPr>
+      <w:r>
+        <w:rPr>
+          <w:b/>
+        </w:rPr>
+        <w:t>$30.000.000</w:t>
+      </w:r>
+      <w:r>
+        <w:t xml:space="preserve"> M/CTE, pagados </w:t>
+      </w:r>
+      <w:r>
+        <w:rPr>
+          <w:b/>
+        </w:rPr>
+        <w:t>el 26 de junio de 2026, a la entrega física</w:t>
       </w:r>
     </w:p>
     <w:p>
       <w:r>
-        <w:t>no libera al PROMITENTE COMPRADOR de las obligaciones derivadas de la promesa</w:t>
+        <w:t xml:space="preserve">   del inmueble, mediante consignación a la cuenta No. </w:t>
+      </w:r>
+      <w:r>
+        <w:rPr>
+          <w:b/>
+        </w:rPr>
+        <w:t>31192532488</w:t>
+      </w:r>
+      <w:r>
+        <w:t xml:space="preserve"> a nombre de</w:t>
       </w:r>
     </w:p>
     <w:p>
       <w:r>
-        <w:t>hasta tanto se otorgue y perfeccione la escritura pública, salvo acuerdo expreso y</w:t>
+        <w:t xml:space="preserve">   </w:t>
+      </w:r>
+      <w:r>
+        <w:rPr>
+          <w:b/>
+        </w:rPr>
+        <w:t>CARLO ROJO</w:t>
+      </w:r>
+      <w:r>
+        <w:t xml:space="preserve">, identificado con la cédula de ciudadanía No. </w:t>
+      </w:r>
+      <w:r>
+        <w:rPr>
+          <w:b/>
+        </w:rPr>
+        <w:t>1.002.089.711</w:t>
+      </w:r>
+      <w:r>
+        <w:t>,</w:t>
       </w:r>
     </w:p>
     <w:p>
       <w:r>
-        <w:t>escrito en contrario.</w:t>
+        <w:t xml:space="preserve">   </w:t>
+      </w:r>
+      <w:r>
+        <w:rPr>
+          <w:b/>
+        </w:rPr>
+        <w:t>por instrucción expresa de LA PROMITENTE VENDEDORA</w:t>
+      </w:r>
+      <w:r>
+        <w:t>.</w:t>
+      </w:r>
+    </w:p>
+    <w:p>
+      <w:pPr>
+        <w:pStyle w:val="ListNumber"/>
+      </w:pPr>
+      <w:r>
+        <w:rPr>
+          <w:b/>
+        </w:rPr>
+        <w:t>$73.000.000</w:t>
+      </w:r>
+      <w:r>
+        <w:t xml:space="preserve"> M/CTE, pagados </w:t>
+      </w:r>
+      <w:r>
+        <w:rPr>
+          <w:b/>
+        </w:rPr>
+        <w:t>el 18 de julio de 2026</w:t>
+      </w:r>
+      <w:r>
+        <w:t xml:space="preserve">, mediante </w:t>
+      </w:r>
+      <w:r>
+        <w:rPr>
+          <w:b/>
+        </w:rPr>
+        <w:t>cheque</w:t>
+      </w:r>
+      <w:r>
+        <w:t xml:space="preserve"> a</w:t>
+      </w:r>
+    </w:p>
+    <w:p>
+      <w:r>
+        <w:t xml:space="preserve">   nombre de </w:t>
+      </w:r>
+      <w:r>
+        <w:rPr>
+          <w:b/>
+        </w:rPr>
+        <w:t>ARELYSON DE JESÚS BETANCUR MONTOYA</w:t>
+      </w:r>
+      <w:r>
+        <w:t xml:space="preserve"> (hijo de LA PROMITENTE</w:t>
+      </w:r>
+    </w:p>
+    <w:p>
+      <w:r>
+        <w:t xml:space="preserve">   VENDEDORA), consignado a su cuenta, **por instrucción expresa de LA PROMITENTE</w:t>
+      </w:r>
+    </w:p>
+    <w:p>
+      <w:r>
+        <w:t xml:space="preserve">   VENDEDORA**.</w:t>
+      </w:r>
+    </w:p>
+    <w:p>
+      <w:pPr>
+        <w:pStyle w:val="ListNumber"/>
+      </w:pPr>
+      <w:r>
+        <w:rPr>
+          <w:b/>
+        </w:rPr>
+        <w:t>$3.100.000</w:t>
+      </w:r>
+      <w:r>
+        <w:t xml:space="preserve"> M/CTE que EL PROMITENTE COMPRADOR </w:t>
+      </w:r>
+      <w:r>
+        <w:rPr>
+          <w:b/>
+        </w:rPr>
+        <w:t>retiene del precio</w:t>
+      </w:r>
+      <w:r>
+        <w:t xml:space="preserve"> y</w:t>
+      </w:r>
+    </w:p>
+    <w:p>
+      <w:r>
+        <w:t xml:space="preserve">   **destina a sufragar el costo de los trámites y documentos de saneamiento del</w:t>
+      </w:r>
+    </w:p>
+    <w:p>
+      <w:r>
+        <w:t xml:space="preserve">   folio** que están a cargo de LA PROMITENTE VENDEDORA (cláusula CUARTA), previo</w:t>
+      </w:r>
+    </w:p>
+    <w:p>
+      <w:r>
+        <w:t xml:space="preserve">   soporte de dichos gastos.</w:t>
+      </w:r>
+    </w:p>
+    <w:p>
+      <w:pPr>
+        <w:pStyle w:val="ListNumber"/>
+      </w:pPr>
+      <w:r>
+        <w:rPr>
+          <w:b/>
+        </w:rPr>
+        <w:t>$4.900.000</w:t>
+      </w:r>
+      <w:r>
+        <w:t xml:space="preserve"> M/CTE, correspondientes al </w:t>
+      </w:r>
+      <w:r>
+        <w:rPr>
+          <w:b/>
+        </w:rPr>
+        <w:t>saldo final</w:t>
+      </w:r>
+      <w:r>
+        <w:t>, que EL PROMITENTE</w:t>
+      </w:r>
+    </w:p>
+    <w:p>
+      <w:r>
+        <w:t xml:space="preserve">   COMPRADOR pagará **una vez culmine el saneamiento del folio y se encuentre lista</w:t>
+      </w:r>
+    </w:p>
+    <w:p>
+      <w:r>
+        <w:t xml:space="preserve">   la firma de la escritura pública** (a la fecha está pendiente la</w:t>
+      </w:r>
+    </w:p>
+    <w:p>
+      <w:r>
+        <w:t xml:space="preserve">   </w:t>
+      </w:r>
+      <w:r>
+        <w:rPr>
+          <w:b/>
+        </w:rPr>
+        <w:t>certificación/paz y salvo de predial</w:t>
+      </w:r>
+      <w:r>
+        <w:t>, según la cláusula QUINTA).</w:t>
+      </w:r>
+    </w:p>
+    <w:p>
+      <w:r>
+        <w:t>LA PROMITENTE VENDEDORA declara que los pagos anteriores (numerales 1 a 3), por</w:t>
+      </w:r>
+    </w:p>
+    <w:p>
+      <w:r>
+        <w:t xml:space="preserve">valor de </w:t>
+      </w:r>
+      <w:r>
+        <w:rPr>
+          <w:b/>
+        </w:rPr>
+        <w:t>$113.000.000</w:t>
+      </w:r>
+      <w:r>
+        <w:t xml:space="preserve">, han sido recibidos </w:t>
+      </w:r>
+      <w:r>
+        <w:rPr>
+          <w:b/>
+        </w:rPr>
+        <w:t>real y efectivamente</w:t>
+      </w:r>
+      <w:r>
+        <w:t xml:space="preserve"> y a entera</w:t>
+      </w:r>
+    </w:p>
+    <w:p>
+      <w:r>
+        <w:t xml:space="preserve">satisfacción, por lo que </w:t>
+      </w:r>
+      <w:r>
+        <w:rPr>
+          <w:b/>
+        </w:rPr>
+        <w:t>no podrá alegar su no pago</w:t>
+      </w:r>
+      <w:r>
+        <w:t>; y renuncia a cualquier</w:t>
+      </w:r>
+    </w:p>
+    <w:p>
+      <w:r>
+        <w:t>reclamación por los pagos efectuados a los terceros que ella misma indicó. Las</w:t>
+      </w:r>
+    </w:p>
+    <w:p>
+      <w:r>
+        <w:t>partes conservarán como soporte los comprobantes de consignación, la copia del</w:t>
+      </w:r>
+    </w:p>
+    <w:p>
+      <w:r>
+        <w:t>cheque y las instrucciones de pago impartidas por LA PROMITENTE VENDEDORA.</w:t>
       </w:r>
     </w:p>
     <w:p>
@@ -270,7 +576,79 @@
         <w:rPr>
           <w:b/>
         </w:rPr>
-        <w:t>TERCERA. SANEAMIENTO PREVIO DEL FOLIO (CONDICIÓN).</w:t>
+        <w:t>TERCERA. FACULTAD DE DESIGNAR TERCERO ADQUIRENTE (CESIÓN).</w:t>
+      </w:r>
+      <w:r>
+        <w:t xml:space="preserve"> Las partes adicionan</w:t>
+      </w:r>
+    </w:p>
+    <w:p>
+      <w:r>
+        <w:t>la promesa en el sentido de facultar al PROMITENTE COMPRADOR para que, al momento</w:t>
+      </w:r>
+    </w:p>
+    <w:p>
+      <w:r>
+        <w:t>de la suscripción de la escritura pública de compraventa, pueda **designar como</w:t>
+      </w:r>
+    </w:p>
+    <w:p>
+      <w:r>
+        <w:t>adquirente del inmueble a una persona natural o jurídica distinta de él**, o</w:t>
+      </w:r>
+    </w:p>
+    <w:p>
+      <w:r>
+        <w:rPr>
+          <w:b/>
+        </w:rPr>
+        <w:t>ceder su posición contractual</w:t>
+      </w:r>
+      <w:r>
+        <w:t xml:space="preserve"> en la presente promesa. Para tal efecto, el</w:t>
+      </w:r>
+    </w:p>
+    <w:p>
+      <w:r>
+        <w:t>PROMITENTE COMPRADOR deberá informar por escrito a LA PROMITENTE VENDEDORA la</w:t>
+      </w:r>
+    </w:p>
+    <w:p>
+      <w:r>
+        <w:t>identidad del tercero designado con anterioridad al otorgamiento de la escritura.</w:t>
+      </w:r>
+    </w:p>
+    <w:p>
+      <w:r>
+        <w:t>La comparecencia de dicho tercero como comprador no alterará el precio, plazos,</w:t>
+      </w:r>
+    </w:p>
+    <w:p>
+      <w:r>
+        <w:t>obligaciones ni demás estipulaciones pactadas. Esta autorización no libera al</w:t>
+      </w:r>
+    </w:p>
+    <w:p>
+      <w:r>
+        <w:t>PROMITENTE COMPRADOR de las obligaciones derivadas de la promesa hasta tanto se</w:t>
+      </w:r>
+    </w:p>
+    <w:p>
+      <w:r>
+        <w:t>otorgue y perfeccione la escritura pública, salvo acuerdo expreso y escrito en</w:t>
+      </w:r>
+    </w:p>
+    <w:p>
+      <w:r>
+        <w:t>contrario.</w:t>
+      </w:r>
+    </w:p>
+    <w:p>
+      <w:r>
+        <w:rPr>
+          <w:b/>
+        </w:rPr>
+        <w:t>CUARTA. SANEAMIENTO PREVIO DEL FOLIO (CONDICIÓN).</w:t>
       </w:r>
       <w:r>
         <w:t xml:space="preserve"> LA PROMITENTE VENDEDORA se</w:t>
@@ -297,21 +675,21 @@
     </w:p>
     <w:p>
       <w:r>
-        <w:t>pública de compraventa, a obtener —a su costa y con anterioridad a la fecha de</w:t>
+        <w:t>pública de compraventa, a obtener —a su costa y **a más tardar el [__] de [____] de</w:t>
       </w:r>
     </w:p>
     <w:p>
       <w:r>
-        <w:t xml:space="preserve">escrituración— el levantamiento y la </w:t>
+        <w:t>2026</w:t>
       </w:r>
       <w:r>
         <w:rPr>
           <w:b/>
         </w:rPr>
-        <w:t>cancelación registral</w:t>
+        <w:t xml:space="preserve">— el levantamiento y la </w:t>
       </w:r>
       <w:r>
-        <w:t xml:space="preserve"> de las siguientes</w:t>
+        <w:t>cancelación registral** de las siguientes</w:t>
       </w:r>
     </w:p>
     <w:p>
@@ -405,7 +783,7 @@
         <w:rPr>
           <w:b/>
         </w:rPr>
-        <w:t>CUARTA. PAZ Y SALVOS.</w:t>
+        <w:t>QUINTA. PAZ Y SALVOS.</w:t>
       </w:r>
       <w:r>
         <w:t xml:space="preserve"> LA PROMITENTE VENDEDORA entregará, a más tardar en la</w:t>
@@ -424,19 +802,67 @@
         <w:rPr>
           <w:b/>
         </w:rPr>
-        <w:t xml:space="preserve">, </w:t>
+        <w:t xml:space="preserve"> y de </w:t>
       </w:r>
       <w:r>
-        <w:t>impuesto predial</w:t>
+        <w:t>valorización</w:t>
       </w:r>
       <w:r>
         <w:rPr>
           <w:b/>
         </w:rPr>
-        <w:t xml:space="preserve"> y </w:t>
+        <w:t xml:space="preserve"> del inmueble. Respecto del </w:t>
       </w:r>
       <w:r>
-        <w:t>valorización** del inmueble.</w:t>
+        <w:t>impuesto</w:t>
+      </w:r>
+    </w:p>
+    <w:p>
+      <w:r>
+        <w:t>predial</w:t>
+      </w:r>
+      <w:r>
+        <w:rPr>
+          <w:b/>
+        </w:rPr>
+        <w:t xml:space="preserve">, por tratarse de un predio </w:t>
+      </w:r>
+      <w:r>
+        <w:t>exento** (vivienda cobijada por la Ley 1537</w:t>
+      </w:r>
+    </w:p>
+    <w:p>
+      <w:r>
+        <w:t xml:space="preserve">de 2012), entregará la </w:t>
+      </w:r>
+      <w:r>
+        <w:rPr>
+          <w:b/>
+        </w:rPr>
+        <w:t>certificación de exención o de no adeudo</w:t>
+      </w:r>
+      <w:r>
+        <w:t xml:space="preserve"> expedida por la</w:t>
+      </w:r>
+    </w:p>
+    <w:p>
+      <w:r>
+        <w:t>autoridad municipal competente, documento que hace las veces de paz y salvo. Las</w:t>
+      </w:r>
+    </w:p>
+    <w:p>
+      <w:r>
+        <w:t>partes dejan constancia de que sobre el inmueble podrá recaer una **contribución de</w:t>
+      </w:r>
+    </w:p>
+    <w:p>
+      <w:r>
+        <w:t>valorización diferida** exigible a los 10 años de la entrega, cuya existencia</w:t>
+      </w:r>
+    </w:p>
+    <w:p>
+      <w:r>
+        <w:t>conoce EL PROMITENTE COMPRADOR.</w:t>
       </w:r>
     </w:p>
     <w:p>
@@ -444,34 +870,68 @@
         <w:rPr>
           <w:b/>
         </w:rPr>
-        <w:t>QUINTA. PODER PARA ESCRITURAR.</w:t>
+        <w:t>SEXTA. PODER IRREVOCABLE PARA ESCRITURAR.</w:t>
       </w:r>
       <w:r>
-        <w:t xml:space="preserve"> En caso de no poder comparecer personalmente al</w:t>
+        <w:t xml:space="preserve"> En caso de no comparecer</w:t>
       </w:r>
     </w:p>
     <w:p>
       <w:r>
-        <w:t>otorgamiento de la escritura pública de compraventa, LA PROMITENTE VENDEDORA</w:t>
+        <w:t>personalmente al otorgamiento de la escritura pública de compraventa, LA PROMITENTE</w:t>
       </w:r>
     </w:p>
     <w:p>
       <w:r>
-        <w:t xml:space="preserve">otorgará </w:t>
+        <w:t>VENDEDORA otorgará **poder especial, mercantil, remunerado e IRREVOCABLE, por</w:t>
+      </w:r>
+    </w:p>
+    <w:p>
+      <w:r>
+        <w:t>escritura pública** —conferido también en interés del apoderado (Art. 1279 C.Co) y</w:t>
+      </w:r>
+    </w:p>
+    <w:p>
+      <w:r>
+        <w:t xml:space="preserve">con </w:t>
       </w:r>
       <w:r>
         <w:rPr>
           <w:b/>
         </w:rPr>
-        <w:t>poder especial por escritura pública</w:t>
+        <w:t>subsistencia pese a la muerte</w:t>
       </w:r>
       <w:r>
-        <w:t xml:space="preserve"> para que en su nombre se suscriba</w:t>
+        <w:t xml:space="preserve"> de la poderdante (Art. 1280 C.Co)— para que</w:t>
       </w:r>
     </w:p>
     <w:p>
       <w:r>
-        <w:t>dicha escritura, sin que ello altere las condiciones aquí pactadas.</w:t>
+        <w:t>en su nombre se suscriba dicha escritura, sin que ello altere las condiciones aquí</w:t>
+      </w:r>
+    </w:p>
+    <w:p>
+      <w:r>
+        <w:t>pactadas. Dicho poder deberá quedar **radicado en la Ventanilla Única de Registro</w:t>
+      </w:r>
+    </w:p>
+    <w:p>
+      <w:r>
+        <w:t>(VUR)</w:t>
+      </w:r>
+      <w:r>
+        <w:rPr>
+          <w:b/>
+        </w:rPr>
+        <w:t xml:space="preserve">. LA PROMITENTE VENDEDORA se obliga a </w:t>
+      </w:r>
+      <w:r>
+        <w:t>no revocar** dicho poder sino por</w:t>
+      </w:r>
+    </w:p>
+    <w:p>
+      <w:r>
+        <w:t>justa causa comprobada.</w:t>
       </w:r>
     </w:p>
     <w:p>
@@ -479,7 +939,128 @@
         <w:rPr>
           <w:b/>
         </w:rPr>
-        <w:t>SEXTA. GASTOS.</w:t>
+        <w:t>SÉPTIMA. INCUMPLIMIENTO Y CLÁUSULA PENAL.</w:t>
+      </w:r>
+      <w:r>
+        <w:t xml:space="preserve"> Si LA PROMITENTE VENDEDORA</w:t>
+      </w:r>
+    </w:p>
+    <w:p>
+      <w:r>
+        <w:rPr>
+          <w:b/>
+        </w:rPr>
+        <w:t>revoca indebidamente el poder</w:t>
+      </w:r>
+      <w:r>
+        <w:t xml:space="preserve">, </w:t>
+      </w:r>
+      <w:r>
+        <w:rPr>
+          <w:b/>
+        </w:rPr>
+        <w:t>no obtiene el saneamiento</w:t>
+      </w:r>
+      <w:r>
+        <w:t xml:space="preserve"> en el plazo de la</w:t>
+      </w:r>
+    </w:p>
+    <w:p>
+      <w:r>
+        <w:t xml:space="preserve">cláusula CUARTA, o </w:t>
+      </w:r>
+      <w:r>
+        <w:rPr>
+          <w:b/>
+        </w:rPr>
+        <w:t>se niega a otorgar o hacer otorgar la escritura pública</w:t>
+      </w:r>
+      <w:r>
+        <w:t>, EL</w:t>
+      </w:r>
+    </w:p>
+    <w:p>
+      <w:r>
+        <w:t xml:space="preserve">PROMITENTE COMPRADOR podrá, a su elección, </w:t>
+      </w:r>
+      <w:r>
+        <w:rPr>
+          <w:b/>
+        </w:rPr>
+        <w:t>exigir el cumplimiento forzoso</w:t>
+      </w:r>
+      <w:r>
+        <w:t xml:space="preserve"> del</w:t>
+      </w:r>
+    </w:p>
+    <w:p>
+      <w:r>
+        <w:t xml:space="preserve">contrato (incluido hacer valer el poder irrevocable) o </w:t>
+      </w:r>
+      <w:r>
+        <w:rPr>
+          <w:b/>
+        </w:rPr>
+        <w:t>declararlo resuelto</w:t>
+      </w:r>
+      <w:r>
+        <w:t>. En</w:t>
+      </w:r>
+    </w:p>
+    <w:p>
+      <w:r>
+        <w:t>cualquier caso, LA PROMITENTE VENDEDORA deberá **restituir la totalidad de las</w:t>
+      </w:r>
+    </w:p>
+    <w:p>
+      <w:r>
+        <w:t>sumas recibidas ($113.000.000)</w:t>
+      </w:r>
+      <w:r>
+        <w:rPr>
+          <w:b/>
+        </w:rPr>
+        <w:t xml:space="preserve"> dentro de los </w:t>
+      </w:r>
+      <w:r>
+        <w:t>[__] días** siguientes al</w:t>
+      </w:r>
+    </w:p>
+    <w:p>
+      <w:r>
+        <w:t xml:space="preserve">requerimiento, junto con una </w:t>
+      </w:r>
+      <w:r>
+        <w:rPr>
+          <w:b/>
+        </w:rPr>
+        <w:t>pena equivalente a $[____]</w:t>
+      </w:r>
+      <w:r>
+        <w:t xml:space="preserve"> a título de cláusula</w:t>
+      </w:r>
+    </w:p>
+    <w:p>
+      <w:r>
+        <w:t>penal, sin perjuicio de las demás acciones legales. Lo anterior no menoscaba la</w:t>
+      </w:r>
+    </w:p>
+    <w:p>
+      <w:r>
+        <w:t>retención del saldo (cláusula SEGUNDA, numeral 4) mientras persista el</w:t>
+      </w:r>
+    </w:p>
+    <w:p>
+      <w:r>
+        <w:t>incumplimiento.</w:t>
+      </w:r>
+    </w:p>
+    <w:p>
+      <w:r>
+        <w:rPr>
+          <w:b/>
+        </w:rPr>
+        <w:t>OCTAVA. GASTOS.</w:t>
       </w:r>
       <w:r>
         <w:t xml:space="preserve"> Los gastos notariales, de registro e impuesto de registro</w:t>
@@ -497,7 +1078,7 @@
     </w:p>
     <w:p>
       <w:r>
-        <w:t xml:space="preserve">(cláusula TERCERA) estarán a cargo de </w:t>
+        <w:t xml:space="preserve">(cláusula CUARTA) estarán a cargo de </w:t>
       </w:r>
       <w:r>
         <w:rPr>
@@ -514,7 +1095,7 @@
         <w:rPr>
           <w:b/>
         </w:rPr>
-        <w:t>SÉPTIMA. VIGENCIA.</w:t>
+        <w:t>NOVENA. VIGENCIA.</w:t>
       </w:r>
       <w:r>
         <w:t xml:space="preserve"> En todo lo demás continúa vigente el contrato de promesa de</w:t>

</xml_diff>

<commit_message>
Otrosi 9844: corrige estado civil de Maria (soltera, separada de Wilson) + paragrafo de constancia; poder radicado en VUR; alerta por juramento de union vigente
Co-Authored-By: Claude Opus 4.8 <noreply@anthropic.com>
Claude-Session: https://claude.ai/code/session_01V3nTS2cxs4zGL1pJrFeNth
</commit_message>
<xml_diff>
--- a/flipping-01-el-tirol-3-apto-9844/Otrosi-Promesa-DEFINITIVO.docx
+++ b/flipping-01-el-tirol-3-apto-9844/Otrosi-Promesa-DEFINITIVO.docx
@@ -113,18 +113,24 @@
         <w:t>43.491.607</w:t>
       </w:r>
       <w:r>
-        <w:t>, de estado civil soltera sin unión marital de hecho, quien actúa en</w:t>
+        <w:t xml:space="preserve">, de estado civil </w:t>
+      </w:r>
+      <w:r>
+        <w:rPr>
+          <w:b/>
+        </w:rPr>
+        <w:t>soltera</w:t>
+      </w:r>
+      <w:r>
+        <w:t>, quien actúa en este acto en su propio</w:t>
       </w:r>
     </w:p>
     <w:p>
       <w:r>
-        <w:t>este acto en su propio nombre y representación, y para todos los efectos de este</w:t>
+        <w:t>nombre y representación, y para todos los efectos de este contrato se denominará</w:t>
       </w:r>
     </w:p>
     <w:p>
-      <w:r>
-        <w:t xml:space="preserve">contrato se denominará </w:t>
-      </w:r>
       <w:r>
         <w:rPr>
           <w:b/>
@@ -783,6 +789,76 @@
         <w:rPr>
           <w:b/>
         </w:rPr>
+        <w:t>PARÁGRAFO — CONSTANCIA DE ESTADO CIVIL Y COTITULARIDAD.</w:t>
+      </w:r>
+      <w:r>
+        <w:t xml:space="preserve"> Las partes dejan</w:t>
+      </w:r>
+    </w:p>
+    <w:p>
+      <w:r>
+        <w:t>constancia de que la afectación a vivienda familiar y el patrimonio de familia del</w:t>
+      </w:r>
+    </w:p>
+    <w:p>
+      <w:r>
+        <w:t>inmueble figuran a favor de LA PROMITENTE VENDEDORA y del señor **WILSON BETANCUR</w:t>
+      </w:r>
+    </w:p>
+    <w:p>
+      <w:r>
+        <w:t>QUIROZ** (C.C. 71.751.443), con quien aquella tuvo unión marital de hecho y de</w:t>
+      </w:r>
+    </w:p>
+    <w:p>
+      <w:r>
+        <w:t xml:space="preserve">quien se encuentra </w:t>
+      </w:r>
+      <w:r>
+        <w:rPr>
+          <w:b/>
+        </w:rPr>
+        <w:t>actualmente separada de hecho</w:t>
+      </w:r>
+      <w:r>
+        <w:t>. El señor Betancur otorgó,</w:t>
+      </w:r>
+    </w:p>
+    <w:p>
+      <w:r>
+        <w:t>conjuntamente con LA PROMITENTE VENDEDORA, el poder especial del **30 de junio de</w:t>
+      </w:r>
+    </w:p>
+    <w:p>
+      <w:r>
+        <w:t>2026** (Notaría Cuarta de Medellín, radicado en el VUR) que faculta la cancelación</w:t>
+      </w:r>
+    </w:p>
+    <w:p>
+      <w:r>
+        <w:t>de dichas limitaciones y la compraventa. ⚠️ **Dado que ese poder declaró una</w:t>
+      </w:r>
+    </w:p>
+    <w:p>
+      <w:r>
+        <w:t>"unión marital de hecho vigente", las partes deberán verificar con la notaría si</w:t>
+      </w:r>
+    </w:p>
+    <w:p>
+      <w:r>
+        <w:t>procede una escritura aclaratoria del estado civil antes de otorgar la escritura de</w:t>
+      </w:r>
+    </w:p>
+    <w:p>
+      <w:r>
+        <w:t>compraventa.**</w:t>
+      </w:r>
+    </w:p>
+    <w:p>
+      <w:r>
+        <w:rPr>
+          <w:b/>
+        </w:rPr>
         <w:t>QUINTA. PAZ Y SALVOS.</w:t>
       </w:r>
       <w:r>

</xml_diff>

<commit_message>
Otrosi 9844: clausula OCTAVA de gastos - notaria/rentas/registro por mitades, levantamientos y saneamiento a cargo de la vendedora
Co-Authored-By: Claude Opus 4.8 <noreply@anthropic.com>
Claude-Session: https://claude.ai/code/session_01V3nTS2cxs4zGL1pJrFeNth
</commit_message>
<xml_diff>
--- a/flipping-01-el-tirol-3-apto-9844/Otrosi-Promesa-DEFINITIVO.docx
+++ b/flipping-01-el-tirol-3-apto-9844/Otrosi-Promesa-DEFINITIVO.docx
@@ -1139,31 +1139,80 @@
         <w:t>OCTAVA. GASTOS.</w:t>
       </w:r>
       <w:r>
-        <w:t xml:space="preserve"> Los gastos notariales, de registro e impuesto de registro</w:t>
-      </w:r>
-    </w:p>
-    <w:p>
-      <w:r>
-        <w:t>derivados de la compraventa se asumirán así: **[por definir entre las partes / por</w:t>
-      </w:r>
-    </w:p>
-    <w:p>
-      <w:r>
-        <w:t>mitades / por cuenta del comprador]**. Los costos del saneamiento del folio</w:t>
-      </w:r>
-    </w:p>
-    <w:p>
-      <w:r>
-        <w:t xml:space="preserve">(cláusula CUARTA) estarán a cargo de </w:t>
+        <w:t xml:space="preserve"> Los gastos de </w:t>
       </w:r>
       <w:r>
         <w:rPr>
           <w:b/>
         </w:rPr>
-        <w:t>LA PROMITENTE VENDEDORA</w:t>
+        <w:t>notaría</w:t>
       </w:r>
       <w:r>
-        <w:t>.</w:t>
+        <w:t xml:space="preserve"> (derechos notariales), de </w:t>
+      </w:r>
+      <w:r>
+        <w:rPr>
+          <w:b/>
+        </w:rPr>
+        <w:t>rentas</w:t>
+      </w:r>
+    </w:p>
+    <w:p>
+      <w:r>
+        <w:t xml:space="preserve">(impuesto de registro) y de </w:t>
+      </w:r>
+      <w:r>
+        <w:rPr>
+          <w:b/>
+        </w:rPr>
+        <w:t>registro</w:t>
+      </w:r>
+      <w:r>
+        <w:t xml:space="preserve"> (derechos de la Oficina de Registro de</w:t>
+      </w:r>
+    </w:p>
+    <w:p>
+      <w:r>
+        <w:t>Instrumentos Públicos) derivados de la escritura de compraventa se asumirán **por</w:t>
+      </w:r>
+    </w:p>
+    <w:p>
+      <w:r>
+        <w:t>partes iguales, es decir, el cincuenta por ciento (50%) a cargo de cada parte**.</w:t>
+      </w:r>
+    </w:p>
+    <w:p>
+      <w:r>
+        <w:t xml:space="preserve">Los costos de los </w:t>
+      </w:r>
+      <w:r>
+        <w:rPr>
+          <w:b/>
+        </w:rPr>
+        <w:t>levantamientos y del saneamiento del folio</w:t>
+      </w:r>
+      <w:r>
+        <w:t xml:space="preserve"> (cláusula CUARTA:</w:t>
+      </w:r>
+    </w:p>
+    <w:p>
+      <w:r>
+        <w:t>cancelación del patrimonio de familia, levantamiento de la afectación a vivienda</w:t>
+      </w:r>
+    </w:p>
+    <w:p>
+      <w:r>
+        <w:t>familiar, retiro de las limitaciones de ISVIMED/Ley 1537 de 2012 y las</w:t>
+      </w:r>
+    </w:p>
+    <w:p>
+      <w:r>
+        <w:t>certificaciones respectivas) estarán **en su totalidad a cargo de LA PROMITENTE</w:t>
+      </w:r>
+    </w:p>
+    <w:p>
+      <w:r>
+        <w:t>VENDEDORA**.</w:t>
       </w:r>
     </w:p>
     <w:p>

</xml_diff>

<commit_message>
Otrosi 9844: Nicolas comparece en doble condicion (nombre propio + apoderado de Maria); incorpora ediciones de la usuaria y corrige typos/cross-refs
Co-Authored-By: Claude Opus 4.8 <noreply@anthropic.com>
Claude-Session: https://claude.ai/code/session_01V3nTS2cxs4zGL1pJrFeNth
</commit_message>
<xml_diff>
--- a/flipping-01-el-tirol-3-apto-9844/Otrosi-Promesa-DEFINITIVO.docx
+++ b/flipping-01-el-tirol-3-apto-9844/Otrosi-Promesa-DEFINITIVO.docx
@@ -27,27 +27,7 @@
           <w:i/>
           <w:color w:val="555555"/>
         </w:rPr>
-        <w:t xml:space="preserve"> Versión consolidada que incorpora la</w:t>
-      </w:r>
-    </w:p>
-    <w:p>
-      <w:pPr>
-        <w:ind w:left="360"/>
-      </w:pPr>
-      <w:r>
-        <w:rPr>
-          <w:b/>
-          <w:i/>
-          <w:color w:val="555555"/>
-        </w:rPr>
-        <w:t>forma de pago y el reconocimiento de pagos</w:t>
-      </w:r>
-      <w:r>
-        <w:rPr>
-          <w:i/>
-          <w:color w:val="555555"/>
-        </w:rPr>
-        <w:t xml:space="preserve"> (incluidos los hechos a terceros</w:t>
+        <w:t xml:space="preserve"> Nicolás comparece en doble condición</w:t>
       </w:r>
     </w:p>
     <w:p>
@@ -59,7 +39,7 @@
           <w:i/>
           <w:color w:val="555555"/>
         </w:rPr>
-        <w:t>por instrucción de la vendedora), la entrega, la facultad de designar tercero y</w:t>
+        <w:t>(en nombre propio como comprador y como apoderado de la vendedora). Campos entre</w:t>
       </w:r>
     </w:p>
     <w:p>
@@ -71,74 +51,12 @@
           <w:i/>
           <w:color w:val="555555"/>
         </w:rPr>
-        <w:t>las cláusulas de protección (saneamiento, paz y salvos, poder irrevocable,</w:t>
-      </w:r>
-    </w:p>
-    <w:p>
-      <w:pPr>
-        <w:ind w:left="360"/>
-      </w:pPr>
-      <w:r>
-        <w:rPr>
-          <w:i/>
-          <w:color w:val="555555"/>
-        </w:rPr>
-        <w:t>cláusula penal y gastos). Campos entre `[ ]` por completar.</w:t>
+        <w:t>`[ ]` por completar.</w:t>
       </w:r>
     </w:p>
     <w:p>
       <w:r>
-        <w:t xml:space="preserve">Los suscritos a saber: </w:t>
-      </w:r>
-      <w:r>
-        <w:rPr>
-          <w:b/>
-        </w:rPr>
-        <w:t>MARÍA VILLALY MONTOYA SERNA</w:t>
-      </w:r>
-      <w:r>
-        <w:t>, mayor de edad, domiciliada</w:t>
-      </w:r>
-    </w:p>
-    <w:p>
-      <w:r>
-        <w:t>en el municipio de Medellín, identificada con la cédula de ciudadanía número</w:t>
-      </w:r>
-    </w:p>
-    <w:p>
-      <w:r>
-        <w:rPr>
-          <w:b/>
-        </w:rPr>
-        <w:t>43.491.607</w:t>
-      </w:r>
-      <w:r>
-        <w:t xml:space="preserve">, de estado civil </w:t>
-      </w:r>
-      <w:r>
-        <w:rPr>
-          <w:b/>
-        </w:rPr>
-        <w:t>soltera</w:t>
-      </w:r>
-      <w:r>
-        <w:t>, quien actúa en este acto en su propio</w:t>
-      </w:r>
-    </w:p>
-    <w:p>
-      <w:r>
-        <w:t>nombre y representación, y para todos los efectos de este contrato se denominará</w:t>
-      </w:r>
-    </w:p>
-    <w:p>
-      <w:r>
-        <w:rPr>
-          <w:b/>
-        </w:rPr>
-        <w:t>LA PROMITENTE VENDEDORA</w:t>
-      </w:r>
-      <w:r>
-        <w:t xml:space="preserve">; y </w:t>
+        <w:t xml:space="preserve">Entre los suscritos a saber: </w:t>
       </w:r>
       <w:r>
         <w:rPr>
@@ -147,18 +65,15 @@
         <w:t>NICOLÁS MEJÍA ACEVEDO</w:t>
       </w:r>
       <w:r>
-        <w:t>,</w:t>
+        <w:t>, mayor de edad, domiciliado</w:t>
       </w:r>
     </w:p>
     <w:p>
       <w:r>
-        <w:t>mayor de edad, domiciliado en el municipio de Medellín, identificado con la cédula</w:t>
+        <w:t>en el municipio de Medellín, identificado con la cédula de ciudadanía número</w:t>
       </w:r>
     </w:p>
     <w:p>
-      <w:r>
-        <w:t xml:space="preserve">de ciudadanía número </w:t>
-      </w:r>
       <w:r>
         <w:rPr>
           <w:b/>
@@ -166,51 +81,120 @@
         <w:t>1.028.031.225</w:t>
       </w:r>
       <w:r>
-        <w:t>, de estado civil soltero sin unión marital</w:t>
+        <w:t>, de estado civil soltero sin unión marital de hecho, quien en</w:t>
       </w:r>
     </w:p>
     <w:p>
       <w:r>
-        <w:t>de hecho, quien actúa en su propio nombre y representación, y se denominará **EL</w:t>
+        <w:t>este acto comparece en una **doble condición: (i) en su propio nombre y</w:t>
       </w:r>
     </w:p>
     <w:p>
       <w:r>
-        <w:t>PROMITENTE COMPRADOR**, hemos decidido de mutuo acuerdo modificar y adicionar el</w:t>
-      </w:r>
-    </w:p>
-    <w:p>
-      <w:r>
-        <w:t>contrato de promesa de compraventa suscrito entre las partes el **13 de mayo de</w:t>
-      </w:r>
-    </w:p>
-    <w:p>
-      <w:r>
-        <w:t>2026</w:t>
+        <w:t>representación</w:t>
       </w:r>
       <w:r>
         <w:rPr>
           <w:b/>
         </w:rPr>
-        <w:t xml:space="preserve">, relacionado con el bien inmueble identificado con el </w:t>
+        <w:t xml:space="preserve">, y para todos los efectos de este contrato se denominará </w:t>
       </w:r>
       <w:r>
-        <w:t>Folio de Matrícula</w:t>
+        <w:t>EL</w:t>
       </w:r>
     </w:p>
     <w:p>
       <w:r>
-        <w:t>Inmobiliaria número 01N-5433424** de la Oficina de Registro de Instrumentos</w:t>
+        <w:t>PROMITENTE COMPRADOR</w:t>
+      </w:r>
+      <w:r>
+        <w:rPr>
+          <w:b/>
+        </w:rPr>
+        <w:t xml:space="preserve">; y </w:t>
+      </w:r>
+      <w:r>
+        <w:t>(ii) como apoderado especial de MARÍA VILLALY MONTOYA</w:t>
       </w:r>
     </w:p>
     <w:p>
       <w:r>
-        <w:t>Públicos de Medellín Norte (Apartamento 9844, Torre 7, Piso -2, urbanización</w:t>
+        <w:t>SERNA**, mayor de edad, domiciliada en el municipio de Medellín, identificada con</w:t>
       </w:r>
     </w:p>
     <w:p>
       <w:r>
-        <w:t>[El Tirol 3]), en los siguientes términos:</w:t>
+        <w:t xml:space="preserve">la cédula de ciudadanía número </w:t>
+      </w:r>
+      <w:r>
+        <w:rPr>
+          <w:b/>
+        </w:rPr>
+        <w:t>43.491.607</w:t>
+      </w:r>
+      <w:r>
+        <w:t>, de estado civil soltera, quien para</w:t>
+      </w:r>
+    </w:p>
+    <w:p>
+      <w:r>
+        <w:t xml:space="preserve">todos los efectos de este contrato se denominará </w:t>
+      </w:r>
+      <w:r>
+        <w:rPr>
+          <w:b/>
+        </w:rPr>
+        <w:t>LA PROMITENTE VENDEDORA</w:t>
+      </w:r>
+      <w:r>
+        <w:t>, según</w:t>
+      </w:r>
+    </w:p>
+    <w:p>
+      <w:r>
+        <w:t>**poder especial otorgado por escritura pública del 30 de junio de 2026 (Notaría</w:t>
+      </w:r>
+    </w:p>
+    <w:p>
+      <w:r>
+        <w:t>Primera de Bello, radicado en el VUR)**; hemos decidido de mutuo acuerdo modificar</w:t>
+      </w:r>
+    </w:p>
+    <w:p>
+      <w:r>
+        <w:t>y adicionar el contrato de promesa de compraventa suscrito entre las partes el</w:t>
+      </w:r>
+    </w:p>
+    <w:p>
+      <w:r>
+        <w:rPr>
+          <w:b/>
+        </w:rPr>
+        <w:t>13 de mayo de 2026</w:t>
+      </w:r>
+      <w:r>
+        <w:t>, relacionado con el bien inmueble identificado con el</w:t>
+      </w:r>
+    </w:p>
+    <w:p>
+      <w:r>
+        <w:rPr>
+          <w:b/>
+        </w:rPr>
+        <w:t>Folio de Matrícula Inmobiliaria número 01N-5433424</w:t>
+      </w:r>
+      <w:r>
+        <w:t xml:space="preserve"> de la Oficina de Registro de</w:t>
+      </w:r>
+    </w:p>
+    <w:p>
+      <w:r>
+        <w:t>Instrumentos Públicos de Medellín Norte (Apartamento 9844, Torre 7, Piso -2,</w:t>
+      </w:r>
+    </w:p>
+    <w:p>
+      <w:r>
+        <w:t>urbanización [El Tirol 3]), en los siguientes términos:</w:t>
       </w:r>
     </w:p>
     <w:p>
@@ -221,17 +205,17 @@
         <w:t>PRIMERA. ENTREGA.</w:t>
       </w:r>
       <w:r>
-        <w:t xml:space="preserve"> Se modifica la cláusula OCTAVA del contrato original,</w:t>
+        <w:t xml:space="preserve"> Se modifica la cláusula OCTAVA del contrato original, dejando</w:t>
       </w:r>
     </w:p>
     <w:p>
       <w:r>
-        <w:t>dejando constancia de que la entrega real y material del inmueble al PROMITENTE</w:t>
+        <w:t>constancia de que la entrega real y material del inmueble al PROMITENTE COMPRADOR</w:t>
       </w:r>
     </w:p>
     <w:p>
       <w:r>
-        <w:t xml:space="preserve">COMPRADOR se realizó el día </w:t>
+        <w:t xml:space="preserve">se realizó el día </w:t>
       </w:r>
       <w:r>
         <w:rPr>
@@ -611,42 +595,37 @@
         <w:t>ceder su posición contractual</w:t>
       </w:r>
       <w:r>
-        <w:t xml:space="preserve"> en la presente promesa. Para tal efecto, el</w:t>
+        <w:t xml:space="preserve"> en la presente promesa, **sin necesidad de</w:t>
       </w:r>
     </w:p>
     <w:p>
       <w:r>
-        <w:t>PROMITENTE COMPRADOR deberá informar por escrito a LA PROMITENTE VENDEDORA la</w:t>
+        <w:t>informar previamente a LA PROMITENTE VENDEDORA la identidad del tercero</w:t>
       </w:r>
     </w:p>
     <w:p>
       <w:r>
-        <w:t>identidad del tercero designado con anterioridad al otorgamiento de la escritura.</w:t>
+        <w:t>designado**. La comparecencia de dicho tercero como comprador no alterará el</w:t>
       </w:r>
     </w:p>
     <w:p>
       <w:r>
-        <w:t>La comparecencia de dicho tercero como comprador no alterará el precio, plazos,</w:t>
+        <w:t>precio, plazos, obligaciones ni demás estipulaciones pactadas. Esta autorización no</w:t>
       </w:r>
     </w:p>
     <w:p>
       <w:r>
-        <w:t>obligaciones ni demás estipulaciones pactadas. Esta autorización no libera al</w:t>
+        <w:t>libera al PROMITENTE COMPRADOR de las obligaciones derivadas de la promesa hasta</w:t>
       </w:r>
     </w:p>
     <w:p>
       <w:r>
-        <w:t>PROMITENTE COMPRADOR de las obligaciones derivadas de la promesa hasta tanto se</w:t>
+        <w:t>tanto se otorgue y perfeccione la escritura pública, salvo acuerdo expreso y escrito</w:t>
       </w:r>
     </w:p>
     <w:p>
       <w:r>
-        <w:t>otorgue y perfeccione la escritura pública, salvo acuerdo expreso y escrito en</w:t>
-      </w:r>
-    </w:p>
-    <w:p>
-      <w:r>
-        <w:t>contrario.</w:t>
+        <w:t>en contrario.</w:t>
       </w:r>
     </w:p>
     <w:p>
@@ -662,26 +641,26 @@
     </w:p>
     <w:p>
       <w:r>
-        <w:t>obliga a entregar el inmueble y el folio de matrícula **libre de todo gravamen y</w:t>
+        <w:t>obliga a entregar todos los documentos necesarios para el saneamiento del inmueble</w:t>
       </w:r>
     </w:p>
     <w:p>
       <w:r>
-        <w:t>limitación al dominio</w:t>
+        <w:t xml:space="preserve">y del folio de matrícula, y como </w:t>
       </w:r>
       <w:r>
         <w:rPr>
           <w:b/>
         </w:rPr>
-        <w:t xml:space="preserve">, y como </w:t>
+        <w:t>condición</w:t>
       </w:r>
       <w:r>
-        <w:t>condición** para el otorgamiento de la escritura</w:t>
+        <w:t xml:space="preserve"> para el otorgamiento de la escritura</w:t>
       </w:r>
     </w:p>
     <w:p>
       <w:r>
-        <w:t>pública de compraventa, a obtener —a su costa y **a más tardar el [__] de [____] de</w:t>
+        <w:t>pública de compraventa, a obtener —a su costa y **a más tardar el 31 de julio de</w:t>
       </w:r>
     </w:p>
     <w:p>
@@ -771,21 +750,6 @@
     </w:p>
     <w:p>
       <w:r>
-        <w:t>LA PROMITENTE VENDEDORA gestionará las comparecencias necesarias para dichos</w:t>
-      </w:r>
-    </w:p>
-    <w:p>
-      <w:r>
-        <w:t>levantamientos (entre ellas, la de los beneficiarios del patrimonio de familia y</w:t>
-      </w:r>
-    </w:p>
-    <w:p>
-      <w:r>
-        <w:t>la del beneficiario de la afectación a vivienda familiar).</w:t>
-      </w:r>
-    </w:p>
-    <w:p>
-      <w:r>
         <w:rPr>
           <w:b/>
         </w:rPr>
@@ -831,27 +795,12 @@
     </w:p>
     <w:p>
       <w:r>
-        <w:t>2026** (Notaría Cuarta de Medellín, radicado en el VUR) que faculta la cancelación</w:t>
+        <w:t>2026** (Notaría Primera de Bello, radicado en el VUR) que faculta la cancelación de</w:t>
       </w:r>
     </w:p>
     <w:p>
       <w:r>
-        <w:t>de dichas limitaciones y la compraventa. ⚠️ **Dado que ese poder declaró una</w:t>
-      </w:r>
-    </w:p>
-    <w:p>
-      <w:r>
-        <w:t>"unión marital de hecho vigente", las partes deberán verificar con la notaría si</w:t>
-      </w:r>
-    </w:p>
-    <w:p>
-      <w:r>
-        <w:t>procede una escritura aclaratoria del estado civil antes de otorgar la escritura de</w:t>
-      </w:r>
-    </w:p>
-    <w:p>
-      <w:r>
-        <w:t>compraventa.**</w:t>
+        <w:t>dichas limitaciones y la compraventa.</w:t>
       </w:r>
     </w:p>
     <w:p>
@@ -890,26 +839,26 @@
         <w:t xml:space="preserve"> del inmueble. Respecto del </w:t>
       </w:r>
       <w:r>
-        <w:t>impuesto</w:t>
+        <w:t>impuesto predial**,</w:t>
       </w:r>
     </w:p>
     <w:p>
       <w:r>
-        <w:t>predial</w:t>
+        <w:t xml:space="preserve">por tratarse de un predio </w:t>
       </w:r>
       <w:r>
         <w:rPr>
           <w:b/>
         </w:rPr>
-        <w:t xml:space="preserve">, por tratarse de un predio </w:t>
+        <w:t>exento</w:t>
       </w:r>
       <w:r>
-        <w:t>exento** (vivienda cobijada por la Ley 1537</w:t>
+        <w:t xml:space="preserve"> (vivienda cobijada por la Ley 1537 de 2012),</w:t>
       </w:r>
     </w:p>
     <w:p>
       <w:r>
-        <w:t xml:space="preserve">de 2012), entregará la </w:t>
+        <w:t xml:space="preserve">entregará la </w:t>
       </w:r>
       <w:r>
         <w:rPr>
@@ -918,27 +867,12 @@
         <w:t>certificación de exención o de no adeudo</w:t>
       </w:r>
       <w:r>
-        <w:t xml:space="preserve"> expedida por la</w:t>
+        <w:t xml:space="preserve"> expedida por la autoridad</w:t>
       </w:r>
     </w:p>
     <w:p>
       <w:r>
-        <w:t>autoridad municipal competente, documento que hace las veces de paz y salvo. Las</w:t>
-      </w:r>
-    </w:p>
-    <w:p>
-      <w:r>
-        <w:t>partes dejan constancia de que sobre el inmueble podrá recaer una **contribución de</w:t>
-      </w:r>
-    </w:p>
-    <w:p>
-      <w:r>
-        <w:t>valorización diferida** exigible a los 10 años de la entrega, cuya existencia</w:t>
-      </w:r>
-    </w:p>
-    <w:p>
-      <w:r>
-        <w:t>conoce EL PROMITENTE COMPRADOR.</w:t>
+        <w:t>municipal competente, documento que hace las veces de paz y salvo.</w:t>
       </w:r>
     </w:p>
     <w:p>
@@ -946,68 +880,25 @@
         <w:rPr>
           <w:b/>
         </w:rPr>
-        <w:t>SEXTA. PODER IRREVOCABLE PARA ESCRITURAR.</w:t>
+        <w:t>SEXTA. PODER PARA ESCRITURAR Y COMPROMISO DE NO REVOCACIÓN.</w:t>
       </w:r>
       <w:r>
-        <w:t xml:space="preserve"> En caso de no comparecer</w:t>
+        <w:t xml:space="preserve"> La escritura pública</w:t>
       </w:r>
     </w:p>
     <w:p>
       <w:r>
-        <w:t>personalmente al otorgamiento de la escritura pública de compraventa, LA PROMITENTE</w:t>
+        <w:t>de compraventa se otorgará con base en el poder especial referido en el parágrafo</w:t>
       </w:r>
     </w:p>
     <w:p>
       <w:r>
-        <w:t>VENDEDORA otorgará **poder especial, mercantil, remunerado e IRREVOCABLE, por</w:t>
+        <w:t>de la cláusula CUARTA. LA PROMITENTE VENDEDORA se obliga a **no revocar dicho poder</w:t>
       </w:r>
     </w:p>
     <w:p>
       <w:r>
-        <w:t>escritura pública** —conferido también en interés del apoderado (Art. 1279 C.Co) y</w:t>
-      </w:r>
-    </w:p>
-    <w:p>
-      <w:r>
-        <w:t xml:space="preserve">con </w:t>
-      </w:r>
-      <w:r>
-        <w:rPr>
-          <w:b/>
-        </w:rPr>
-        <w:t>subsistencia pese a la muerte</w:t>
-      </w:r>
-      <w:r>
-        <w:t xml:space="preserve"> de la poderdante (Art. 1280 C.Co)— para que</w:t>
-      </w:r>
-    </w:p>
-    <w:p>
-      <w:r>
-        <w:t>en su nombre se suscriba dicha escritura, sin que ello altere las condiciones aquí</w:t>
-      </w:r>
-    </w:p>
-    <w:p>
-      <w:r>
-        <w:t>pactadas. Dicho poder deberá quedar **radicado en la Ventanilla Única de Registro</w:t>
-      </w:r>
-    </w:p>
-    <w:p>
-      <w:r>
-        <w:t>(VUR)</w:t>
-      </w:r>
-      <w:r>
-        <w:rPr>
-          <w:b/>
-        </w:rPr>
-        <w:t xml:space="preserve">. LA PROMITENTE VENDEDORA se obliga a </w:t>
-      </w:r>
-      <w:r>
-        <w:t>no revocar** dicho poder sino por</w:t>
-      </w:r>
-    </w:p>
-    <w:p>
-      <w:r>
-        <w:t>justa causa comprobada.</w:t>
+        <w:t>sino por justa causa comprobada** hasta el perfeccionamiento y registro de la venta.</w:t>
       </w:r>
     </w:p>
     <w:p>
@@ -1018,32 +909,26 @@
         <w:t>SÉPTIMA. INCUMPLIMIENTO Y CLÁUSULA PENAL.</w:t>
       </w:r>
       <w:r>
-        <w:t xml:space="preserve"> Si LA PROMITENTE VENDEDORA</w:t>
+        <w:t xml:space="preserve"> Si LA PROMITENTE VENDEDORA **revoca</w:t>
       </w:r>
     </w:p>
     <w:p>
       <w:r>
-        <w:rPr>
-          <w:b/>
-        </w:rPr>
-        <w:t>revoca indebidamente el poder</w:t>
-      </w:r>
-      <w:r>
-        <w:t xml:space="preserve">, </w:t>
+        <w:t>indebidamente el poder</w:t>
       </w:r>
       <w:r>
         <w:rPr>
           <w:b/>
         </w:rPr>
-        <w:t>no obtiene el saneamiento</w:t>
+        <w:t xml:space="preserve">, </w:t>
       </w:r>
       <w:r>
-        <w:t xml:space="preserve"> en el plazo de la</w:t>
+        <w:t>no obtiene el saneamiento** en el plazo de la cláusula</w:t>
       </w:r>
     </w:p>
     <w:p>
       <w:r>
-        <w:t xml:space="preserve">cláusula CUARTA, o </w:t>
+        <w:t xml:space="preserve">CUARTA, o </w:t>
       </w:r>
       <w:r>
         <w:rPr>
@@ -1052,12 +937,12 @@
         <w:t>se niega a otorgar o hacer otorgar la escritura pública</w:t>
       </w:r>
       <w:r>
-        <w:t>, EL</w:t>
+        <w:t>, EL PROMITENTE</w:t>
       </w:r>
     </w:p>
     <w:p>
       <w:r>
-        <w:t xml:space="preserve">PROMITENTE COMPRADOR podrá, a su elección, </w:t>
+        <w:t xml:space="preserve">COMPRADOR podrá, a su elección, </w:t>
       </w:r>
       <w:r>
         <w:rPr>
@@ -1066,12 +951,12 @@
         <w:t>exigir el cumplimiento forzoso</w:t>
       </w:r>
       <w:r>
-        <w:t xml:space="preserve"> del</w:t>
+        <w:t xml:space="preserve"> del contrato</w:t>
       </w:r>
     </w:p>
     <w:p>
       <w:r>
-        <w:t xml:space="preserve">contrato (incluido hacer valer el poder irrevocable) o </w:t>
+        <w:t xml:space="preserve">(incluido hacer valer el poder) o </w:t>
       </w:r>
       <w:r>
         <w:rPr>
@@ -1080,17 +965,17 @@
         <w:t>declararlo resuelto</w:t>
       </w:r>
       <w:r>
-        <w:t>. En</w:t>
+        <w:t>. En cualquier caso, LA</w:t>
       </w:r>
     </w:p>
     <w:p>
       <w:r>
-        <w:t>cualquier caso, LA PROMITENTE VENDEDORA deberá **restituir la totalidad de las</w:t>
+        <w:t>PROMITENTE VENDEDORA deberá **restituir la totalidad de las sumas recibidas</w:t>
       </w:r>
     </w:p>
     <w:p>
       <w:r>
-        <w:t>sumas recibidas ($113.000.000)</w:t>
+        <w:t>($113.000.000)</w:t>
       </w:r>
       <w:r>
         <w:rPr>
@@ -1099,36 +984,28 @@
         <w:t xml:space="preserve"> dentro de los </w:t>
       </w:r>
       <w:r>
-        <w:t>[__] días** siguientes al</w:t>
+        <w:t>5 días** siguientes al requerimiento, junto con una</w:t>
       </w:r>
     </w:p>
     <w:p>
       <w:r>
-        <w:t xml:space="preserve">requerimiento, junto con una </w:t>
-      </w:r>
-      <w:r>
         <w:rPr>
           <w:b/>
         </w:rPr>
-        <w:t>pena equivalente a $[____]</w:t>
+        <w:t>pena equivalente a $12.100.000</w:t>
       </w:r>
       <w:r>
-        <w:t xml:space="preserve"> a título de cláusula</w:t>
+        <w:t xml:space="preserve"> a título de cláusula penal, sin perjuicio de las</w:t>
       </w:r>
     </w:p>
     <w:p>
       <w:r>
-        <w:t>penal, sin perjuicio de las demás acciones legales. Lo anterior no menoscaba la</w:t>
+        <w:t>demás acciones legales. Lo anterior no menoscaba la retención del saldo (cláusula</w:t>
       </w:r>
     </w:p>
     <w:p>
       <w:r>
-        <w:t>retención del saldo (cláusula SEGUNDA, numeral 4) mientras persista el</w:t>
-      </w:r>
-    </w:p>
-    <w:p>
-      <w:r>
-        <w:t>incumplimiento.</w:t>
+        <w:t>SEGUNDA, numeral 5) mientras persista el incumplimiento.</w:t>
       </w:r>
     </w:p>
     <w:p>
@@ -1238,32 +1115,84 @@
     </w:p>
     <w:p>
       <w:r>
-        <w:t>de igual valor y tenor, en Medellín, a los [__] días del mes de [____] del año</w:t>
+        <w:t>de igual valor y tenor, en Medellín, a los **21 días del mes de julio del año</w:t>
       </w:r>
     </w:p>
     <w:p>
       <w:r>
-        <w:t>2026.</w:t>
+        <w:t>2026**.</w:t>
       </w:r>
     </w:p>
     <w:p>
       <w:r>
-        <w:t>LA PROMITENTE VENDEDORA,                     EL PROMITENTE COMPRADOR,</w:t>
+        <w:rPr>
+          <w:b/>
+        </w:rPr>
+        <w:t>LA PROMITENTE VENDEDORA,</w:t>
       </w:r>
     </w:p>
     <w:p>
       <w:r>
-        <w:t>_____________________________               _____________________________</w:t>
+        <w:t>MARÍA VILLALY MONTOYA SERNA, representada por su apoderado especial:</w:t>
       </w:r>
     </w:p>
     <w:p>
       <w:r>
-        <w:t>MARÍA VILLALY MONTOYA SERNA                  NICOLÁS MEJÍA ACEVEDO</w:t>
+        <w:t>_____________________________</w:t>
       </w:r>
     </w:p>
     <w:p>
       <w:r>
-        <w:t>C.C. No. 43.491.607                          C.C. No. 1.028.031.225</w:t>
+        <w:rPr>
+          <w:b/>
+        </w:rPr>
+        <w:t>NICOLÁS MEJÍA ACEVEDO</w:t>
+      </w:r>
+    </w:p>
+    <w:p>
+      <w:r>
+        <w:t>C.C. No. 1.028.031.225</w:t>
+      </w:r>
+    </w:p>
+    <w:p>
+      <w:r>
+        <w:t>(en representación de LA PROMITENTE VENDEDORA, según poder E.P. del 30-06-2026,</w:t>
+      </w:r>
+    </w:p>
+    <w:p>
+      <w:r>
+        <w:t>Notaría Primera de Bello)</w:t>
+      </w:r>
+    </w:p>
+    <w:p>
+      <w:r>
+        <w:rPr>
+          <w:b/>
+        </w:rPr>
+        <w:t>EL PROMITENTE COMPRADOR,</w:t>
+      </w:r>
+    </w:p>
+    <w:p>
+      <w:r>
+        <w:t>_____________________________</w:t>
+      </w:r>
+    </w:p>
+    <w:p>
+      <w:r>
+        <w:rPr>
+          <w:b/>
+        </w:rPr>
+        <w:t>NICOLÁS MEJÍA ACEVEDO</w:t>
+      </w:r>
+    </w:p>
+    <w:p>
+      <w:r>
+        <w:t>C.C. No. 1.028.031.225</w:t>
+      </w:r>
+    </w:p>
+    <w:p>
+      <w:r>
+        <w:t>(en su propio nombre)</w:t>
       </w:r>
     </w:p>
     <w:sectPr>

</xml_diff>

<commit_message>
Otrosi 9844: nueva clausula SEPTIMA fecha de la escritura (a criterio de la vendedora tras el saneamiento); renumera clausulas siguientes
Co-Authored-By: Claude Opus 4.8 <noreply@anthropic.com>
Claude-Session: https://claude.ai/code/session_01V3nTS2cxs4zGL1pJrFeNth
</commit_message>
<xml_diff>
--- a/flipping-01-el-tirol-3-apto-9844/Otrosi-Promesa-DEFINITIVO.docx
+++ b/flipping-01-el-tirol-3-apto-9844/Otrosi-Promesa-DEFINITIVO.docx
@@ -906,7 +906,38 @@
         <w:rPr>
           <w:b/>
         </w:rPr>
-        <w:t>SÉPTIMA. INCUMPLIMIENTO Y CLÁUSULA PENAL.</w:t>
+        <w:t>SÉPTIMA. FECHA DE LA ESCRITURA.</w:t>
+      </w:r>
+      <w:r>
+        <w:t xml:space="preserve"> Las partes modifican la promesa en el sentido de</w:t>
+      </w:r>
+    </w:p>
+    <w:p>
+      <w:r>
+        <w:t>que la **escritura pública de compraventa se otorgará en la fecha que determine LA</w:t>
+      </w:r>
+    </w:p>
+    <w:p>
+      <w:r>
+        <w:t>PROMITENTE VENDEDORA**, una vez culminado el saneamiento del folio (cláusula</w:t>
+      </w:r>
+    </w:p>
+    <w:p>
+      <w:r>
+        <w:t>CUARTA), quedando **sin efecto cualquier fecha de escrituración fijada en el</w:t>
+      </w:r>
+    </w:p>
+    <w:p>
+      <w:r>
+        <w:t>contrato de promesa original**.</w:t>
+      </w:r>
+    </w:p>
+    <w:p>
+      <w:r>
+        <w:rPr>
+          <w:b/>
+        </w:rPr>
+        <w:t>OCTAVA. INCUMPLIMIENTO Y CLÁUSULA PENAL.</w:t>
       </w:r>
       <w:r>
         <w:t xml:space="preserve"> Si LA PROMITENTE VENDEDORA **revoca</w:t>
@@ -1013,7 +1044,7 @@
         <w:rPr>
           <w:b/>
         </w:rPr>
-        <w:t>OCTAVA. GASTOS.</w:t>
+        <w:t>NOVENA. GASTOS.</w:t>
       </w:r>
       <w:r>
         <w:t xml:space="preserve"> Los gastos de </w:t>
@@ -1097,7 +1128,7 @@
         <w:rPr>
           <w:b/>
         </w:rPr>
-        <w:t>NOVENA. VIGENCIA.</w:t>
+        <w:t>DÉCIMA. VIGENCIA.</w:t>
       </w:r>
       <w:r>
         <w:t xml:space="preserve"> En todo lo demás continúa vigente el contrato de promesa de</w:t>

</xml_diff>

<commit_message>
Otrosi 9844: la fecha de la escritura la determina el comprador (Nicolas), no la vendedora
Co-Authored-By: Claude Opus 4.8 <noreply@anthropic.com>
Claude-Session: https://claude.ai/code/session_01V3nTS2cxs4zGL1pJrFeNth
</commit_message>
<xml_diff>
--- a/flipping-01-el-tirol-3-apto-9844/Otrosi-Promesa-DEFINITIVO.docx
+++ b/flipping-01-el-tirol-3-apto-9844/Otrosi-Promesa-DEFINITIVO.docx
@@ -914,12 +914,12 @@
     </w:p>
     <w:p>
       <w:r>
-        <w:t>que la **escritura pública de compraventa se otorgará en la fecha que determine LA</w:t>
+        <w:t>que la **escritura pública de compraventa se otorgará en la fecha que determine EL</w:t>
       </w:r>
     </w:p>
     <w:p>
       <w:r>
-        <w:t>PROMITENTE VENDEDORA**, una vez culminado el saneamiento del folio (cláusula</w:t>
+        <w:t>PROMITENTE COMPRADOR**, una vez culminado el saneamiento del folio (cláusula</w:t>
       </w:r>
     </w:p>
     <w:p>

</xml_diff>